<commit_message>
Citar entrevista y revisión documental en la tabla de técnicas del informe de Introducción al Trabajo Social
Co-Authored-By: Claude Sonnet 5.5 <noreply@anthropic.com>
Claude-Session: https://claude.ai/code/session_01ELiiEMNxLSZU1C1isiGyKM
</commit_message>
<xml_diff>
--- a/deber4_introduccion_trabajo_social/Introduccion_N_4_corregido.docx
+++ b/deber4_introduccion_trabajo_social/Introduccion_N_4_corregido.docx
@@ -5620,197 +5620,12 @@
                       <w:szCs w:val="20"/>
                     </w:rPr>
                   </w:pPr>
-                  <w:proofErr w:type="spellStart"/>
                   <w:r>
                     <w:rPr>
                       <w:sz w:val="20"/>
                       <w:szCs w:val="20"/>
                     </w:rPr>
-                    <w:t>Posibilita</w:t>
-                  </w:r>
-                  <w:proofErr w:type="spellEnd"/>
-                  <w:r>
-                    <w:rPr>
-                      <w:sz w:val="20"/>
-                      <w:szCs w:val="20"/>
-                    </w:rPr>
-                    <w:t xml:space="preserve"> </w:t>
-                  </w:r>
-                  <w:proofErr w:type="spellStart"/>
-                  <w:r>
-                    <w:rPr>
-                      <w:sz w:val="20"/>
-                      <w:szCs w:val="20"/>
-                    </w:rPr>
-                    <w:t>profundizar</w:t>
-                  </w:r>
-                  <w:proofErr w:type="spellEnd"/>
-                  <w:r>
-                    <w:rPr>
-                      <w:sz w:val="20"/>
-                      <w:szCs w:val="20"/>
-                    </w:rPr>
-                    <w:t xml:space="preserve"> de </w:t>
-                  </w:r>
-                  <w:proofErr w:type="spellStart"/>
-                  <w:r>
-                    <w:rPr>
-                      <w:sz w:val="20"/>
-                      <w:szCs w:val="20"/>
-                    </w:rPr>
-                    <w:t>manera</w:t>
-                  </w:r>
-                  <w:proofErr w:type="spellEnd"/>
-                  <w:r>
-                    <w:rPr>
-                      <w:sz w:val="20"/>
-                      <w:szCs w:val="20"/>
-                    </w:rPr>
-                    <w:t xml:space="preserve"> </w:t>
-                  </w:r>
-                  <w:proofErr w:type="spellStart"/>
-                  <w:r>
-                    <w:rPr>
-                      <w:sz w:val="20"/>
-                      <w:szCs w:val="20"/>
-                    </w:rPr>
-                    <w:t>cualitativa</w:t>
-                  </w:r>
-                  <w:proofErr w:type="spellEnd"/>
-                  <w:r>
-                    <w:rPr>
-                      <w:sz w:val="20"/>
-                      <w:szCs w:val="20"/>
-                    </w:rPr>
-                    <w:t xml:space="preserve"> </w:t>
-                  </w:r>
-                  <w:proofErr w:type="spellStart"/>
-                  <w:r>
-                    <w:rPr>
-                      <w:sz w:val="20"/>
-                      <w:szCs w:val="20"/>
-                    </w:rPr>
-                    <w:t>en</w:t>
-                  </w:r>
-                  <w:proofErr w:type="spellEnd"/>
-                  <w:r>
-                    <w:rPr>
-                      <w:sz w:val="20"/>
-                      <w:szCs w:val="20"/>
-                    </w:rPr>
-                    <w:t xml:space="preserve"> las </w:t>
-                  </w:r>
-                  <w:proofErr w:type="spellStart"/>
-                  <w:r>
-                    <w:rPr>
-                      <w:sz w:val="20"/>
-                      <w:szCs w:val="20"/>
-                    </w:rPr>
-                    <w:t>motivaciones</w:t>
-                  </w:r>
-                  <w:proofErr w:type="spellEnd"/>
-                  <w:r>
-                    <w:rPr>
-                      <w:sz w:val="20"/>
-                      <w:szCs w:val="20"/>
-                    </w:rPr>
-                    <w:t xml:space="preserve">, </w:t>
-                  </w:r>
-                  <w:proofErr w:type="spellStart"/>
-                  <w:r>
-                    <w:rPr>
-                      <w:sz w:val="20"/>
-                      <w:szCs w:val="20"/>
-                    </w:rPr>
-                    <w:t>percepciones</w:t>
-                  </w:r>
-                  <w:proofErr w:type="spellEnd"/>
-                  <w:r>
-                    <w:rPr>
-                      <w:sz w:val="20"/>
-                      <w:szCs w:val="20"/>
-                    </w:rPr>
-                    <w:t xml:space="preserve"> y </w:t>
-                  </w:r>
-                  <w:proofErr w:type="spellStart"/>
-                  <w:r>
-                    <w:rPr>
-                      <w:sz w:val="20"/>
-                      <w:szCs w:val="20"/>
-                    </w:rPr>
-                    <w:t>experiencias</w:t>
-                  </w:r>
-                  <w:proofErr w:type="spellEnd"/>
-                  <w:r>
-                    <w:rPr>
-                      <w:sz w:val="20"/>
-                      <w:szCs w:val="20"/>
-                    </w:rPr>
-                    <w:t xml:space="preserve"> </w:t>
-                  </w:r>
-                  <w:proofErr w:type="spellStart"/>
-                  <w:r>
-                    <w:rPr>
-                      <w:sz w:val="20"/>
-                      <w:szCs w:val="20"/>
-                    </w:rPr>
-                    <w:t>personales</w:t>
-                  </w:r>
-                  <w:proofErr w:type="spellEnd"/>
-                  <w:r>
-                    <w:rPr>
-                      <w:sz w:val="20"/>
-                      <w:szCs w:val="20"/>
-                    </w:rPr>
-                    <w:t xml:space="preserve"> </w:t>
-                  </w:r>
-                  <w:proofErr w:type="spellStart"/>
-                  <w:r>
-                    <w:rPr>
-                      <w:sz w:val="20"/>
-                      <w:szCs w:val="20"/>
-                    </w:rPr>
-                    <w:t>relacionadas</w:t>
-                  </w:r>
-                  <w:proofErr w:type="spellEnd"/>
-                  <w:r>
-                    <w:rPr>
-                      <w:sz w:val="20"/>
-                      <w:szCs w:val="20"/>
-                    </w:rPr>
-                    <w:t xml:space="preserve"> con </w:t>
-                  </w:r>
-                  <w:proofErr w:type="spellStart"/>
-                  <w:r>
-                    <w:rPr>
-                      <w:sz w:val="20"/>
-                      <w:szCs w:val="20"/>
-                    </w:rPr>
-                    <w:t>el</w:t>
-                  </w:r>
-                  <w:proofErr w:type="spellEnd"/>
-                  <w:r>
-                    <w:rPr>
-                      <w:sz w:val="20"/>
-                      <w:szCs w:val="20"/>
-                    </w:rPr>
-                    <w:t xml:space="preserve"> </w:t>
-                  </w:r>
-                  <w:proofErr w:type="spellStart"/>
-                  <w:r>
-                    <w:rPr>
-                      <w:sz w:val="20"/>
-                      <w:szCs w:val="20"/>
-                    </w:rPr>
-                    <w:t>abandono</w:t>
-                  </w:r>
-                  <w:proofErr w:type="spellEnd"/>
-                  <w:r>
-                    <w:rPr>
-                      <w:sz w:val="20"/>
-                      <w:szCs w:val="20"/>
-                    </w:rPr>
-                    <w:t xml:space="preserve"> escolar.</w:t>
+                    <w:t xml:space="preserve">Es una actividad social entre dos o más personas que participan en una conversación y construyen conocimiento sobre sí mismas y su entorno (Sparkes &amp; Smith, 2014, citado en Ramírez-Macías &amp; Bortolotti, 2024, p. 62). Posibilita profundizar de manera cualitativa en las motivaciones, percepciones y experiencias personales relacionadas con el abandono escolar (Ramírez-Macías &amp; Bortolotti, 2024, p. 65).</w:t>
                   </w:r>
                 </w:p>
               </w:tc>
@@ -6002,229 +5817,12 @@
                       <w:szCs w:val="20"/>
                     </w:rPr>
                   </w:pPr>
-                  <w:proofErr w:type="spellStart"/>
                   <w:r>
                     <w:rPr>
                       <w:sz w:val="20"/>
                       <w:szCs w:val="20"/>
                     </w:rPr>
-                    <w:t>Facilita</w:t>
-                  </w:r>
-                  <w:proofErr w:type="spellEnd"/>
-                  <w:r>
-                    <w:rPr>
-                      <w:sz w:val="20"/>
-                      <w:szCs w:val="20"/>
-                    </w:rPr>
-                    <w:t xml:space="preserve"> </w:t>
-                  </w:r>
-                  <w:proofErr w:type="spellStart"/>
-                  <w:r>
-                    <w:rPr>
-                      <w:sz w:val="20"/>
-                      <w:szCs w:val="20"/>
-                    </w:rPr>
-                    <w:t>el</w:t>
-                  </w:r>
-                  <w:proofErr w:type="spellEnd"/>
-                  <w:r>
-                    <w:rPr>
-                      <w:sz w:val="20"/>
-                      <w:szCs w:val="20"/>
-                    </w:rPr>
-                    <w:t xml:space="preserve"> </w:t>
-                  </w:r>
-                  <w:proofErr w:type="spellStart"/>
-                  <w:r>
-                    <w:rPr>
-                      <w:sz w:val="20"/>
-                      <w:szCs w:val="20"/>
-                    </w:rPr>
-                    <w:t>acceso</w:t>
-                  </w:r>
-                  <w:proofErr w:type="spellEnd"/>
-                  <w:r>
-                    <w:rPr>
-                      <w:sz w:val="20"/>
-                      <w:szCs w:val="20"/>
-                    </w:rPr>
-                    <w:t xml:space="preserve"> </w:t>
-                  </w:r>
-                  <w:proofErr w:type="gramStart"/>
-                  <w:r>
-                    <w:rPr>
-                      <w:sz w:val="20"/>
-                      <w:szCs w:val="20"/>
-                    </w:rPr>
-                    <w:t>a</w:t>
-                  </w:r>
-                  <w:proofErr w:type="gramEnd"/>
-                  <w:r>
-                    <w:rPr>
-                      <w:sz w:val="20"/>
-                      <w:szCs w:val="20"/>
-                    </w:rPr>
-                    <w:t xml:space="preserve"> </w:t>
-                  </w:r>
-                  <w:proofErr w:type="spellStart"/>
-                  <w:r>
-                    <w:rPr>
-                      <w:sz w:val="20"/>
-                      <w:szCs w:val="20"/>
-                    </w:rPr>
-                    <w:t>información</w:t>
-                  </w:r>
-                  <w:proofErr w:type="spellEnd"/>
-                  <w:r>
-                    <w:rPr>
-                      <w:sz w:val="20"/>
-                      <w:szCs w:val="20"/>
-                    </w:rPr>
-                    <w:t xml:space="preserve"> </w:t>
-                  </w:r>
-                  <w:proofErr w:type="spellStart"/>
-                  <w:r>
-                    <w:rPr>
-                      <w:sz w:val="20"/>
-                      <w:szCs w:val="20"/>
-                    </w:rPr>
-                    <w:t>estadística</w:t>
-                  </w:r>
-                  <w:proofErr w:type="spellEnd"/>
-                  <w:r>
-                    <w:rPr>
-                      <w:sz w:val="20"/>
-                      <w:szCs w:val="20"/>
-                    </w:rPr>
-                    <w:t xml:space="preserve"> </w:t>
-                  </w:r>
-                  <w:proofErr w:type="spellStart"/>
-                  <w:r>
-                    <w:rPr>
-                      <w:sz w:val="20"/>
-                      <w:szCs w:val="20"/>
-                    </w:rPr>
-                    <w:t>oficial</w:t>
-                  </w:r>
-                  <w:proofErr w:type="spellEnd"/>
-                  <w:r>
-                    <w:rPr>
-                      <w:sz w:val="20"/>
-                      <w:szCs w:val="20"/>
-                    </w:rPr>
-                    <w:t xml:space="preserve"> y </w:t>
-                  </w:r>
-                  <w:proofErr w:type="spellStart"/>
-                  <w:r>
-                    <w:rPr>
-                      <w:sz w:val="20"/>
-                      <w:szCs w:val="20"/>
-                    </w:rPr>
-                    <w:t>actualizada</w:t>
-                  </w:r>
-                  <w:proofErr w:type="spellEnd"/>
-                  <w:r>
-                    <w:rPr>
-                      <w:sz w:val="20"/>
-                      <w:szCs w:val="20"/>
-                    </w:rPr>
-                    <w:t xml:space="preserve"> </w:t>
-                  </w:r>
-                  <w:proofErr w:type="spellStart"/>
-                  <w:r>
-                    <w:rPr>
-                      <w:sz w:val="20"/>
-                      <w:szCs w:val="20"/>
-                    </w:rPr>
-                    <w:t>sobre</w:t>
-                  </w:r>
-                  <w:proofErr w:type="spellEnd"/>
-                  <w:r>
-                    <w:rPr>
-                      <w:sz w:val="20"/>
-                      <w:szCs w:val="20"/>
-                    </w:rPr>
-                    <w:t xml:space="preserve"> </w:t>
-                  </w:r>
-                  <w:proofErr w:type="spellStart"/>
-                  <w:r>
-                    <w:rPr>
-                      <w:sz w:val="20"/>
-                      <w:szCs w:val="20"/>
-                    </w:rPr>
-                    <w:t>tasas</w:t>
-                  </w:r>
-                  <w:proofErr w:type="spellEnd"/>
-                  <w:r>
-                    <w:rPr>
-                      <w:sz w:val="20"/>
-                      <w:szCs w:val="20"/>
-                    </w:rPr>
-                    <w:t xml:space="preserve"> de </w:t>
-                  </w:r>
-                  <w:proofErr w:type="spellStart"/>
-                  <w:r>
-                    <w:rPr>
-                      <w:sz w:val="20"/>
-                      <w:szCs w:val="20"/>
-                    </w:rPr>
-                    <w:t>deserción</w:t>
-                  </w:r>
-                  <w:proofErr w:type="spellEnd"/>
-                  <w:r>
-                    <w:rPr>
-                      <w:sz w:val="20"/>
-                      <w:szCs w:val="20"/>
-                    </w:rPr>
-                    <w:t xml:space="preserve">, sin </w:t>
-                  </w:r>
-                  <w:proofErr w:type="spellStart"/>
-                  <w:r>
-                    <w:rPr>
-                      <w:sz w:val="20"/>
-                      <w:szCs w:val="20"/>
-                    </w:rPr>
-                    <w:t>necesidad</w:t>
-                  </w:r>
-                  <w:proofErr w:type="spellEnd"/>
-                  <w:r>
-                    <w:rPr>
-                      <w:sz w:val="20"/>
-                      <w:szCs w:val="20"/>
-                    </w:rPr>
-                    <w:t xml:space="preserve"> de </w:t>
-                  </w:r>
-                  <w:proofErr w:type="spellStart"/>
-                  <w:r>
-                    <w:rPr>
-                      <w:sz w:val="20"/>
-                      <w:szCs w:val="20"/>
-                    </w:rPr>
-                    <w:t>contacto</w:t>
-                  </w:r>
-                  <w:proofErr w:type="spellEnd"/>
-                  <w:r>
-                    <w:rPr>
-                      <w:sz w:val="20"/>
-                      <w:szCs w:val="20"/>
-                    </w:rPr>
-                    <w:t xml:space="preserve"> </w:t>
-                  </w:r>
-                  <w:proofErr w:type="spellStart"/>
-                  <w:r>
-                    <w:rPr>
-                      <w:sz w:val="20"/>
-                      <w:szCs w:val="20"/>
-                    </w:rPr>
-                    <w:t>directo</w:t>
-                  </w:r>
-                  <w:proofErr w:type="spellEnd"/>
-                  <w:r>
-                    <w:rPr>
-                      <w:sz w:val="20"/>
-                      <w:szCs w:val="20"/>
-                    </w:rPr>
-                    <w:t xml:space="preserve"> con la población.</w:t>
+                    <w:t xml:space="preserve">Es una técnica indirecta que trabaja con documentos, es decir, soportes materiales o digitales que recogen manifestaciones de la realidad social y que no fueron creados por quien investiga (Ramírez-Macías &amp; Bortolotti, 2024, pp. 62, 69). Facilita el acceso a información estadística oficial y actualizada sobre tasas de deserción, sin necesidad de contacto directo con la población.</w:t>
                   </w:r>
                 </w:p>
               </w:tc>
@@ -10145,6 +9743,40 @@
               </w:r>
             </w:hyperlink>
             <w:bookmarkEnd w:id="0"/>
+          </w:p>
+          <w:p>
+            <w:pPr>
+              <w:spacing w:before="120" w:after="120"/>
+              <w:ind w:left="720" w:hanging="720"/>
+              <w:jc w:val="both"/>
+              <w:rPr>
+                <w:sz w:val="22"/>
+                <w:lang w:val="es-EC"/>
+              </w:rPr>
+            </w:pPr>
+            <w:r>
+              <w:rPr>
+                <w:sz w:val="22"/>
+                <w:lang w:val="es-EC"/>
+              </w:rPr>
+              <w:t xml:space="preserve">Ramírez-Macías, G., &amp; Bortolotti, A. (2024). Técnicas de recolección de datos. En J. Piedra, G. Ramírez-Macías, &amp; A. R. Rodríguez-Sánchez (Eds.), </w:t>
+            </w:r>
+            <w:r>
+              <w:rPr>
+                <w:i/>
+                <w:iCs/>
+                <w:sz w:val="22"/>
+                <w:lang w:val="es-EC"/>
+              </w:rPr>
+              <w:t xml:space="preserve">Manual de iniciación a la investigación cualitativa en Ciencias de la Actividad Física y el Deporte</w:t>
+            </w:r>
+            <w:r>
+              <w:rPr>
+                <w:sz w:val="22"/>
+                <w:lang w:val="es-EC"/>
+              </w:rPr>
+              <w:t xml:space="preserve"> (pp. 61–73). Octaedro. https://cris.unibo.it/handle/11585/1011007</w:t>
+            </w:r>
           </w:p>
           <w:p>
             <w:pPr>

</xml_diff>

<commit_message>
Citar la encuesta en la tabla de técnicas del informe de Introducción al Trabajo Social
Co-Authored-By: Claude Sonnet 5.5 <noreply@anthropic.com>
Claude-Session: https://claude.ai/code/session_01ELiiEMNxLSZU1C1isiGyKM
</commit_message>
<xml_diff>
--- a/deber4_introduccion_trabajo_social/Introduccion_N_4_corregido.docx
+++ b/deber4_introduccion_trabajo_social/Introduccion_N_4_corregido.docx
@@ -5213,213 +5213,12 @@
                       <w:szCs w:val="20"/>
                     </w:rPr>
                   </w:pPr>
-                  <w:proofErr w:type="spellStart"/>
                   <w:r>
                     <w:rPr>
                       <w:sz w:val="20"/>
                       <w:szCs w:val="20"/>
                     </w:rPr>
-                    <w:t>Permite</w:t>
-                  </w:r>
-                  <w:proofErr w:type="spellEnd"/>
-                  <w:r>
-                    <w:rPr>
-                      <w:sz w:val="20"/>
-                      <w:szCs w:val="20"/>
-                    </w:rPr>
-                    <w:t xml:space="preserve"> </w:t>
-                  </w:r>
-                  <w:proofErr w:type="spellStart"/>
-                  <w:r>
-                    <w:rPr>
-                      <w:sz w:val="20"/>
-                      <w:szCs w:val="20"/>
-                    </w:rPr>
-                    <w:t>recoger</w:t>
-                  </w:r>
-                  <w:proofErr w:type="spellEnd"/>
-                  <w:r>
-                    <w:rPr>
-                      <w:sz w:val="20"/>
-                      <w:szCs w:val="20"/>
-                    </w:rPr>
-                    <w:t xml:space="preserve"> </w:t>
-                  </w:r>
-                  <w:proofErr w:type="spellStart"/>
-                  <w:r>
-                    <w:rPr>
-                      <w:sz w:val="20"/>
-                      <w:szCs w:val="20"/>
-                    </w:rPr>
-                    <w:t>información</w:t>
-                  </w:r>
-                  <w:proofErr w:type="spellEnd"/>
-                  <w:r>
-                    <w:rPr>
-                      <w:sz w:val="20"/>
-                      <w:szCs w:val="20"/>
-                    </w:rPr>
-                    <w:t xml:space="preserve"> </w:t>
-                  </w:r>
-                  <w:proofErr w:type="spellStart"/>
-                  <w:r>
-                    <w:rPr>
-                      <w:sz w:val="20"/>
-                      <w:szCs w:val="20"/>
-                    </w:rPr>
-                    <w:t>cuantificable</w:t>
-                  </w:r>
-                  <w:proofErr w:type="spellEnd"/>
-                  <w:r>
-                    <w:rPr>
-                      <w:sz w:val="20"/>
-                      <w:szCs w:val="20"/>
-                    </w:rPr>
-                    <w:t xml:space="preserve"> de un </w:t>
-                  </w:r>
-                  <w:proofErr w:type="spellStart"/>
-                  <w:r>
-                    <w:rPr>
-                      <w:sz w:val="20"/>
-                      <w:szCs w:val="20"/>
-                    </w:rPr>
-                    <w:t>número</w:t>
-                  </w:r>
-                  <w:proofErr w:type="spellEnd"/>
-                  <w:r>
-                    <w:rPr>
-                      <w:sz w:val="20"/>
-                      <w:szCs w:val="20"/>
-                    </w:rPr>
-                    <w:t xml:space="preserve"> </w:t>
-                  </w:r>
-                  <w:proofErr w:type="spellStart"/>
-                  <w:r>
-                    <w:rPr>
-                      <w:sz w:val="20"/>
-                      <w:szCs w:val="20"/>
-                    </w:rPr>
-                    <w:t>amplio</w:t>
-                  </w:r>
-                  <w:proofErr w:type="spellEnd"/>
-                  <w:r>
-                    <w:rPr>
-                      <w:sz w:val="20"/>
-                      <w:szCs w:val="20"/>
-                    </w:rPr>
-                    <w:t xml:space="preserve"> de </w:t>
-                  </w:r>
-                  <w:proofErr w:type="spellStart"/>
-                  <w:r>
-                    <w:rPr>
-                      <w:sz w:val="20"/>
-                      <w:szCs w:val="20"/>
-                    </w:rPr>
-                    <w:t>familias</w:t>
-                  </w:r>
-                  <w:proofErr w:type="spellEnd"/>
-                  <w:r>
-                    <w:rPr>
-                      <w:sz w:val="20"/>
-                      <w:szCs w:val="20"/>
-                    </w:rPr>
-                    <w:t xml:space="preserve"> </w:t>
-                  </w:r>
-                  <w:proofErr w:type="spellStart"/>
-                  <w:r>
-                    <w:rPr>
-                      <w:sz w:val="20"/>
-                      <w:szCs w:val="20"/>
-                    </w:rPr>
-                    <w:t>sobre</w:t>
-                  </w:r>
-                  <w:proofErr w:type="spellEnd"/>
-                  <w:r>
-                    <w:rPr>
-                      <w:sz w:val="20"/>
-                      <w:szCs w:val="20"/>
-                    </w:rPr>
-                    <w:t xml:space="preserve"> las </w:t>
-                  </w:r>
-                  <w:proofErr w:type="spellStart"/>
-                  <w:r>
-                    <w:rPr>
-                      <w:sz w:val="20"/>
-                      <w:szCs w:val="20"/>
-                    </w:rPr>
-                    <w:t>causas</w:t>
-                  </w:r>
-                  <w:proofErr w:type="spellEnd"/>
-                  <w:r>
-                    <w:rPr>
-                      <w:sz w:val="20"/>
-                      <w:szCs w:val="20"/>
-                    </w:rPr>
-                    <w:t xml:space="preserve"> </w:t>
-                  </w:r>
-                  <w:proofErr w:type="spellStart"/>
-                  <w:r>
-                    <w:rPr>
-                      <w:sz w:val="20"/>
-                      <w:szCs w:val="20"/>
-                    </w:rPr>
-                    <w:t>percibidas</w:t>
-                  </w:r>
-                  <w:proofErr w:type="spellEnd"/>
-                  <w:r>
-                    <w:rPr>
-                      <w:sz w:val="20"/>
-                      <w:szCs w:val="20"/>
-                    </w:rPr>
-                    <w:t xml:space="preserve"> del </w:t>
-                  </w:r>
-                  <w:proofErr w:type="spellStart"/>
-                  <w:r>
-                    <w:rPr>
-                      <w:sz w:val="20"/>
-                      <w:szCs w:val="20"/>
-                    </w:rPr>
-                    <w:t>abandono</w:t>
-                  </w:r>
-                  <w:proofErr w:type="spellEnd"/>
-                  <w:r>
-                    <w:rPr>
-                      <w:sz w:val="20"/>
-                      <w:szCs w:val="20"/>
-                    </w:rPr>
-                    <w:t xml:space="preserve"> escolar y sus </w:t>
-                  </w:r>
-                  <w:proofErr w:type="spellStart"/>
-                  <w:r>
-                    <w:rPr>
-                      <w:sz w:val="20"/>
-                      <w:szCs w:val="20"/>
-                    </w:rPr>
-                    <w:t>condiciones</w:t>
-                  </w:r>
-                  <w:proofErr w:type="spellEnd"/>
-                  <w:r>
-                    <w:rPr>
-                      <w:sz w:val="20"/>
-                      <w:szCs w:val="20"/>
-                    </w:rPr>
-                    <w:t xml:space="preserve"> </w:t>
-                  </w:r>
-                  <w:proofErr w:type="spellStart"/>
-                  <w:r>
-                    <w:rPr>
-                      <w:sz w:val="20"/>
-                      <w:szCs w:val="20"/>
-                    </w:rPr>
-                    <w:t>socioeconómicas</w:t>
-                  </w:r>
-                  <w:proofErr w:type="spellEnd"/>
-                  <w:r>
-                    <w:rPr>
-                      <w:sz w:val="20"/>
-                      <w:szCs w:val="20"/>
-                    </w:rPr>
-                    <w:t>.</w:t>
+                    <w:t xml:space="preserve">Es una técnica que busca obtener información que suministra un grupo o muestra de personas acerca de sí mismas o sobre un tema en particular (Arias, 2012, citado en Jiménez González, 2020, p. 63). Permite recoger información cuantificable de un número amplio de familias sobre las causas percibidas del abandono escolar y sus condiciones socioeconómicas, pues es una de las estrategias de recolección de datos de la investigación cuantitativa (Jiménez González, 2020, p. 62).</w:t>
                   </w:r>
                 </w:p>
               </w:tc>
@@ -9695,6 +9494,40 @@
                 <w:lang w:val="es-EC"/>
               </w:rPr>
               <w:t xml:space="preserve">, 105–134. https://doi.org/10.30827/tsg-gsw.v11.15249</w:t>
+            </w:r>
+          </w:p>
+          <w:p>
+            <w:pPr>
+              <w:spacing w:before="120" w:after="120"/>
+              <w:ind w:left="720" w:hanging="720"/>
+              <w:jc w:val="both"/>
+              <w:rPr>
+                <w:sz w:val="22"/>
+                <w:lang w:val="es-EC"/>
+              </w:rPr>
+            </w:pPr>
+            <w:r>
+              <w:rPr>
+                <w:sz w:val="22"/>
+                <w:lang w:val="es-EC"/>
+              </w:rPr>
+              <w:t xml:space="preserve">Jiménez González, L. L. (2020). Impacto de la investigación cuantitativa en la actualidad. </w:t>
+            </w:r>
+            <w:r>
+              <w:rPr>
+                <w:i/>
+                <w:iCs/>
+                <w:sz w:val="22"/>
+                <w:lang w:val="es-EC"/>
+              </w:rPr>
+              <w:t xml:space="preserve">Convergence Tech Revista Científica, 4</w:t>
+            </w:r>
+            <w:r>
+              <w:rPr>
+                <w:sz w:val="22"/>
+                <w:lang w:val="es-EC"/>
+              </w:rPr>
+              <w:t xml:space="preserve">(1), 59–68. https://www.researchgate.net/publication/352750927_IMPACTO_DE_LA_INVESTIGACION_CUANTITATIVA_EN_LA_ACTUALIDAD</w:t>
             </w:r>
           </w:p>
           <w:p>

</xml_diff>

<commit_message>
Quitar la cita de Bradshaw (1972) del informe de Introducción al Trabajo Social
Co-Authored-By: Claude Sonnet 5.5 <noreply@anthropic.com>
Claude-Session: https://claude.ai/code/session_01ELiiEMNxLSZU1C1isiGyKM
</commit_message>
<xml_diff>
--- a/deber4_introduccion_trabajo_social/Introduccion_N_4_corregido.docx
+++ b/deber4_introduccion_trabajo_social/Introduccion_N_4_corregido.docx
@@ -7953,7 +7953,7 @@
               <w:rPr>
                 <w:lang w:val="es-EC"/>
               </w:rPr>
-              <w:t>Las necesidades sentidas son aquellas que la propia población identifica y expresa a partir de las dificultades que experimenta en su vida cotidiana (Bradshaw, 1972). En el caso de la deserción escolar, por ejemplo, una familia podría manifestar que necesita apoyo económico para cubrir los gastos de transporte, alimentación o materiales escolares, debido a que estas dificultades están afectando la permanencia del estudiante en el sistema educativo.</w:t>
+              <w:t>Las necesidades sentidas son aquellas que la propia población identifica y expresa a partir de las dificultades que experimenta en su vida cotidiana. En el caso de la deserción escolar, por ejemplo, una familia podría manifestar que necesita apoyo económico para cubrir los gastos de transporte, alimentación o materiales escolares, debido a que estas dificultades están afectando la permanencia del estudiante en el sistema educativo.</w:t>
             </w:r>
           </w:p>
           <w:p>
@@ -7966,7 +7966,7 @@
               <w:rPr>
                 <w:lang w:val="es-EC"/>
               </w:rPr>
-              <w:t>Por otra parte, las necesidades normativas son aquellas que se identifican a partir de criterios técnicos, profesionales o institucionales establecidos para determinar una situación de necesidad (Bradshaw, 1972). En este caso, mediante la revisión de registros de asistencia, seguimiento académico y otros indicadores institucionales, el profesional podría identificar que un estudiante presenta un alto riesgo de abandonar sus estudios y requiere acompañamiento y seguimiento para favorecer su permanencia educativa.</w:t>
+              <w:t>Por otra parte, las necesidades normativas son aquellas que se identifican a partir de criterios técnicos, profesionales o institucionales establecidos para determinar una situación de necesidad. En este caso, mediante la revisión de registros de asistencia, seguimiento académico y otros indicadores institucionales, el profesional podría identificar que un estudiante presenta un alto riesgo de abandonar sus estudios y requiere acompañamiento y seguimiento para favorecer su permanencia educativa.</w:t>
             </w:r>
           </w:p>
           <w:p>
@@ -9381,40 +9381,6 @@
             <w:gridSpan w:val="2"/>
             <w:vAlign w:val="center"/>
           </w:tcPr>
-          <w:p>
-            <w:pPr>
-              <w:spacing w:before="120" w:after="120"/>
-              <w:ind w:left="720" w:hanging="720"/>
-              <w:jc w:val="both"/>
-              <w:rPr>
-                <w:sz w:val="22"/>
-                <w:lang w:val="es-EC"/>
-              </w:rPr>
-            </w:pPr>
-            <w:r>
-              <w:rPr>
-                <w:sz w:val="22"/>
-                <w:lang w:val="es-EC"/>
-              </w:rPr>
-              <w:t xml:space="preserve">Bradshaw, J. (1972). A taxonomy of social need. In G. McLachlan (Ed.), </w:t>
-            </w:r>
-            <w:r>
-              <w:rPr>
-                <w:i/>
-                <w:iCs/>
-                <w:sz w:val="22"/>
-                <w:lang w:val="es-EC"/>
-              </w:rPr>
-              <w:t xml:space="preserve">Problems and progress in medical care: Essays on current research</w:t>
-            </w:r>
-            <w:r>
-              <w:rPr>
-                <w:sz w:val="22"/>
-                <w:lang w:val="es-EC"/>
-              </w:rPr>
-              <w:t xml:space="preserve"> (7th series, pp. 71–82). Oxford University Press.</w:t>
-            </w:r>
-          </w:p>
           <w:p>
             <w:pPr>
               <w:spacing w:before="120" w:after="120"/>

</xml_diff>

<commit_message>
Citar el diagnóstico social y la atención prioritaria en el informe de Introducción al Trabajo Social
Co-Authored-By: Claude Sonnet 5.5 <noreply@anthropic.com>
Claude-Session: https://claude.ai/code/session_01ELiiEMNxLSZU1C1isiGyKM
</commit_message>
<xml_diff>
--- a/deber4_introduccion_trabajo_social/Introduccion_N_4_corregido.docx
+++ b/deber4_introduccion_trabajo_social/Introduccion_N_4_corregido.docx
@@ -879,343 +879,7 @@
           </w:tcPr>
           <w:p>
             <w:r>
-              <w:t xml:space="preserve">El </w:t>
-            </w:r>
-            <w:proofErr w:type="spellStart"/>
-            <w:r>
-              <w:t>diagnóstico</w:t>
-            </w:r>
-            <w:proofErr w:type="spellEnd"/>
-            <w:r>
-              <w:t xml:space="preserve"> social </w:t>
-            </w:r>
-            <w:proofErr w:type="spellStart"/>
-            <w:r>
-              <w:t>constituye</w:t>
-            </w:r>
-            <w:proofErr w:type="spellEnd"/>
-            <w:r>
-              <w:t xml:space="preserve"> la </w:t>
-            </w:r>
-            <w:proofErr w:type="spellStart"/>
-            <w:r>
-              <w:t>fase</w:t>
-            </w:r>
-            <w:proofErr w:type="spellEnd"/>
-            <w:r>
-              <w:t xml:space="preserve"> </w:t>
-            </w:r>
-            <w:proofErr w:type="spellStart"/>
-            <w:r>
-              <w:t>inicial</w:t>
-            </w:r>
-            <w:proofErr w:type="spellEnd"/>
-            <w:r>
-              <w:t xml:space="preserve"> y fundamental de </w:t>
-            </w:r>
-            <w:proofErr w:type="spellStart"/>
-            <w:r>
-              <w:t>todo</w:t>
-            </w:r>
-            <w:proofErr w:type="spellEnd"/>
-            <w:r>
-              <w:t xml:space="preserve"> </w:t>
-            </w:r>
-            <w:proofErr w:type="spellStart"/>
-            <w:r>
-              <w:t>proceso</w:t>
-            </w:r>
-            <w:proofErr w:type="spellEnd"/>
-            <w:r>
-              <w:t xml:space="preserve"> de </w:t>
-            </w:r>
-            <w:proofErr w:type="spellStart"/>
-            <w:r>
-              <w:t>intervención</w:t>
-            </w:r>
-            <w:proofErr w:type="spellEnd"/>
-            <w:r>
-              <w:t xml:space="preserve"> </w:t>
-            </w:r>
-            <w:proofErr w:type="spellStart"/>
-            <w:r>
-              <w:t>profesional</w:t>
-            </w:r>
-            <w:proofErr w:type="spellEnd"/>
-            <w:r>
-              <w:t xml:space="preserve"> </w:t>
-            </w:r>
-            <w:proofErr w:type="spellStart"/>
-            <w:r>
-              <w:t>en</w:t>
-            </w:r>
-            <w:proofErr w:type="spellEnd"/>
-            <w:r>
-              <w:t xml:space="preserve"> </w:t>
-            </w:r>
-            <w:proofErr w:type="spellStart"/>
-            <w:r>
-              <w:t>Trabajo</w:t>
-            </w:r>
-            <w:proofErr w:type="spellEnd"/>
-            <w:r>
-              <w:t xml:space="preserve"> Social, </w:t>
-            </w:r>
-            <w:proofErr w:type="spellStart"/>
-            <w:r>
-              <w:t>pues</w:t>
-            </w:r>
-            <w:proofErr w:type="spellEnd"/>
-            <w:r>
-              <w:t xml:space="preserve"> </w:t>
-            </w:r>
-            <w:proofErr w:type="spellStart"/>
-            <w:r>
-              <w:t>permite</w:t>
-            </w:r>
-            <w:proofErr w:type="spellEnd"/>
-            <w:r>
-              <w:t xml:space="preserve"> </w:t>
-            </w:r>
-            <w:proofErr w:type="spellStart"/>
-            <w:r>
-              <w:t>conocer</w:t>
-            </w:r>
-            <w:proofErr w:type="spellEnd"/>
-            <w:r>
-              <w:t xml:space="preserve">, </w:t>
-            </w:r>
-            <w:proofErr w:type="spellStart"/>
-            <w:r>
-              <w:t>comprender</w:t>
-            </w:r>
-            <w:proofErr w:type="spellEnd"/>
-            <w:r>
-              <w:t xml:space="preserve"> y </w:t>
-            </w:r>
-            <w:proofErr w:type="spellStart"/>
-            <w:r>
-              <w:t>analizar</w:t>
-            </w:r>
-            <w:proofErr w:type="spellEnd"/>
-            <w:r>
-              <w:t xml:space="preserve"> la </w:t>
-            </w:r>
-            <w:proofErr w:type="spellStart"/>
-            <w:r>
-              <w:t>realidad</w:t>
-            </w:r>
-            <w:proofErr w:type="spellEnd"/>
-            <w:r>
-              <w:t xml:space="preserve"> de </w:t>
-            </w:r>
-            <w:proofErr w:type="spellStart"/>
-            <w:r>
-              <w:t>individuos</w:t>
-            </w:r>
-            <w:proofErr w:type="spellEnd"/>
-            <w:r>
-              <w:t xml:space="preserve">, </w:t>
-            </w:r>
-            <w:proofErr w:type="spellStart"/>
-            <w:r>
-              <w:t>familias</w:t>
-            </w:r>
-            <w:proofErr w:type="spellEnd"/>
-            <w:r>
-              <w:t xml:space="preserve">, </w:t>
-            </w:r>
-            <w:proofErr w:type="spellStart"/>
-            <w:r>
-              <w:t>grupos</w:t>
-            </w:r>
-            <w:proofErr w:type="spellEnd"/>
-            <w:r>
-              <w:t xml:space="preserve"> o </w:t>
-            </w:r>
-            <w:proofErr w:type="spellStart"/>
-            <w:r>
-              <w:t>comunidades</w:t>
-            </w:r>
-            <w:proofErr w:type="spellEnd"/>
-            <w:r>
-              <w:t xml:space="preserve">, </w:t>
-            </w:r>
-            <w:proofErr w:type="spellStart"/>
-            <w:r>
-              <w:t>identificando</w:t>
-            </w:r>
-            <w:proofErr w:type="spellEnd"/>
-            <w:r>
-              <w:t xml:space="preserve"> </w:t>
-            </w:r>
-            <w:proofErr w:type="spellStart"/>
-            <w:r>
-              <w:t>necesidades</w:t>
-            </w:r>
-            <w:proofErr w:type="spellEnd"/>
-            <w:r>
-              <w:t xml:space="preserve">, </w:t>
-            </w:r>
-            <w:proofErr w:type="spellStart"/>
-            <w:r>
-              <w:t>recursos</w:t>
-            </w:r>
-            <w:proofErr w:type="spellEnd"/>
-            <w:r>
-              <w:t xml:space="preserve"> y </w:t>
-            </w:r>
-            <w:proofErr w:type="spellStart"/>
-            <w:r>
-              <w:t>factores</w:t>
-            </w:r>
-            <w:proofErr w:type="spellEnd"/>
-            <w:r>
-              <w:t xml:space="preserve"> de </w:t>
-            </w:r>
-            <w:proofErr w:type="spellStart"/>
-            <w:r>
-              <w:t>riesgo</w:t>
-            </w:r>
-            <w:proofErr w:type="spellEnd"/>
-            <w:r>
-              <w:t xml:space="preserve"> que </w:t>
-            </w:r>
-            <w:proofErr w:type="spellStart"/>
-            <w:r>
-              <w:t>orientan</w:t>
-            </w:r>
-            <w:proofErr w:type="spellEnd"/>
-            <w:r>
-              <w:t xml:space="preserve"> </w:t>
-            </w:r>
-            <w:proofErr w:type="spellStart"/>
-            <w:r>
-              <w:t>una</w:t>
-            </w:r>
-            <w:proofErr w:type="spellEnd"/>
-            <w:r>
-              <w:t xml:space="preserve"> </w:t>
-            </w:r>
-            <w:proofErr w:type="spellStart"/>
-            <w:r>
-              <w:t>intervención</w:t>
-            </w:r>
-            <w:proofErr w:type="spellEnd"/>
-            <w:r>
-              <w:t xml:space="preserve"> </w:t>
-            </w:r>
-            <w:proofErr w:type="spellStart"/>
-            <w:r>
-              <w:t>pertinente</w:t>
-            </w:r>
-            <w:proofErr w:type="spellEnd"/>
-            <w:r>
-              <w:t xml:space="preserve"> y </w:t>
-            </w:r>
-            <w:proofErr w:type="spellStart"/>
-            <w:r>
-              <w:t>eficaz</w:t>
-            </w:r>
-            <w:proofErr w:type="spellEnd"/>
-            <w:r>
-              <w:t xml:space="preserve">. Sin </w:t>
-            </w:r>
-            <w:proofErr w:type="spellStart"/>
-            <w:r>
-              <w:t>este</w:t>
-            </w:r>
-            <w:proofErr w:type="spellEnd"/>
-            <w:r>
-              <w:t xml:space="preserve"> </w:t>
-            </w:r>
-            <w:proofErr w:type="spellStart"/>
-            <w:r>
-              <w:t>ejercicio</w:t>
-            </w:r>
-            <w:proofErr w:type="spellEnd"/>
-            <w:r>
-              <w:t xml:space="preserve"> </w:t>
-            </w:r>
-            <w:proofErr w:type="spellStart"/>
-            <w:r>
-              <w:t>metodológico</w:t>
-            </w:r>
-            <w:proofErr w:type="spellEnd"/>
-            <w:r>
-              <w:t xml:space="preserve"> </w:t>
-            </w:r>
-            <w:proofErr w:type="spellStart"/>
-            <w:r>
-              <w:t>riguroso</w:t>
-            </w:r>
-            <w:proofErr w:type="spellEnd"/>
-            <w:r>
-              <w:t xml:space="preserve">, </w:t>
-            </w:r>
-            <w:proofErr w:type="spellStart"/>
-            <w:r>
-              <w:t>cualquier</w:t>
-            </w:r>
-            <w:proofErr w:type="spellEnd"/>
-            <w:r>
-              <w:t xml:space="preserve"> </w:t>
-            </w:r>
-            <w:proofErr w:type="spellStart"/>
-            <w:r>
-              <w:t>intervención</w:t>
-            </w:r>
-            <w:proofErr w:type="spellEnd"/>
-            <w:r>
-              <w:t xml:space="preserve"> </w:t>
-            </w:r>
-            <w:proofErr w:type="spellStart"/>
-            <w:r>
-              <w:t>corre</w:t>
-            </w:r>
-            <w:proofErr w:type="spellEnd"/>
-            <w:r>
-              <w:t xml:space="preserve"> </w:t>
-            </w:r>
-            <w:proofErr w:type="spellStart"/>
-            <w:r>
-              <w:t>el</w:t>
-            </w:r>
-            <w:proofErr w:type="spellEnd"/>
-            <w:r>
-              <w:t xml:space="preserve"> </w:t>
-            </w:r>
-            <w:proofErr w:type="spellStart"/>
-            <w:r>
-              <w:t>riesgo</w:t>
-            </w:r>
-            <w:proofErr w:type="spellEnd"/>
-            <w:r>
-              <w:t xml:space="preserve"> de </w:t>
-            </w:r>
-            <w:proofErr w:type="spellStart"/>
-            <w:r>
-              <w:t>resultar</w:t>
-            </w:r>
-            <w:proofErr w:type="spellEnd"/>
-            <w:r>
-              <w:t xml:space="preserve"> </w:t>
-            </w:r>
-            <w:proofErr w:type="spellStart"/>
-            <w:r>
-              <w:t>improvisada</w:t>
-            </w:r>
-            <w:proofErr w:type="spellEnd"/>
-            <w:r>
-              <w:t xml:space="preserve"> o </w:t>
-            </w:r>
-            <w:proofErr w:type="spellStart"/>
-            <w:r>
-              <w:t>descontextualizada</w:t>
-            </w:r>
-            <w:proofErr w:type="spellEnd"/>
-            <w:r>
-              <w:t>.</w:t>
+              <w:t xml:space="preserve">El diagnóstico social constituye la fase inicial y fundamental de todo proceso de intervención profesional en Trabajo Social, pues permite conocer, comprender y analizar la realidad de individuos, familias, grupos o comunidades, identificando necesidades, recursos y factores de riesgo que orientan una intervención pertinente y eficaz. Las necesidades sociales son su objeto de análisis, y su estudio es indispensable en cualquier modelo de intervención, tanto en la dimensión individual-familiar como en la grupal y comunitaria (Fernández-de-Castro &amp; Díaz-Herráiz, 2021, p. 107). Sin este ejercicio metodológico riguroso, cualquier intervención corre el riesgo de resultar improvisada o descontextualizada.</w:t>
             </w:r>
           </w:p>
           <w:p>
@@ -3827,527 +3491,7 @@
           </w:p>
           <w:p>
             <w:r>
-              <w:t xml:space="preserve">La </w:t>
-            </w:r>
-            <w:proofErr w:type="spellStart"/>
-            <w:r>
-              <w:t>deserción</w:t>
-            </w:r>
-            <w:proofErr w:type="spellEnd"/>
-            <w:r>
-              <w:t xml:space="preserve"> escolar </w:t>
-            </w:r>
-            <w:proofErr w:type="spellStart"/>
-            <w:r>
-              <w:t>afecta</w:t>
-            </w:r>
-            <w:proofErr w:type="spellEnd"/>
-            <w:r>
-              <w:t xml:space="preserve"> </w:t>
-            </w:r>
-            <w:proofErr w:type="spellStart"/>
-            <w:r>
-              <w:t>principalmente</w:t>
-            </w:r>
-            <w:proofErr w:type="spellEnd"/>
-            <w:r>
-              <w:t xml:space="preserve"> a </w:t>
-            </w:r>
-            <w:proofErr w:type="spellStart"/>
-            <w:r>
-              <w:t>niños</w:t>
-            </w:r>
-            <w:proofErr w:type="spellEnd"/>
-            <w:r>
-              <w:t xml:space="preserve">, </w:t>
-            </w:r>
-            <w:proofErr w:type="spellStart"/>
-            <w:r>
-              <w:t>niñas</w:t>
-            </w:r>
-            <w:proofErr w:type="spellEnd"/>
-            <w:r>
-              <w:t xml:space="preserve"> y </w:t>
-            </w:r>
-            <w:proofErr w:type="spellStart"/>
-            <w:r>
-              <w:t>adolescentes</w:t>
-            </w:r>
-            <w:proofErr w:type="spellEnd"/>
-            <w:r>
-              <w:t xml:space="preserve"> </w:t>
-            </w:r>
-            <w:proofErr w:type="spellStart"/>
-            <w:r>
-              <w:t>en</w:t>
-            </w:r>
-            <w:proofErr w:type="spellEnd"/>
-            <w:r>
-              <w:t xml:space="preserve"> </w:t>
-            </w:r>
-            <w:proofErr w:type="spellStart"/>
-            <w:r>
-              <w:t>edad</w:t>
-            </w:r>
-            <w:proofErr w:type="spellEnd"/>
-            <w:r>
-              <w:t xml:space="preserve"> escolar, </w:t>
-            </w:r>
-            <w:proofErr w:type="spellStart"/>
-            <w:r>
-              <w:t>aproximadamente</w:t>
-            </w:r>
-            <w:proofErr w:type="spellEnd"/>
-            <w:r>
-              <w:t xml:space="preserve"> entre 5 y 17 </w:t>
-            </w:r>
-            <w:proofErr w:type="spellStart"/>
-            <w:r>
-              <w:t>años</w:t>
-            </w:r>
-            <w:proofErr w:type="spellEnd"/>
-            <w:r>
-              <w:t xml:space="preserve">, con </w:t>
-            </w:r>
-            <w:proofErr w:type="spellStart"/>
-            <w:r>
-              <w:t>una</w:t>
-            </w:r>
-            <w:proofErr w:type="spellEnd"/>
-            <w:r>
-              <w:t xml:space="preserve"> </w:t>
-            </w:r>
-            <w:proofErr w:type="spellStart"/>
-            <w:r>
-              <w:t>incidencia</w:t>
-            </w:r>
-            <w:proofErr w:type="spellEnd"/>
-            <w:r>
-              <w:t xml:space="preserve"> </w:t>
-            </w:r>
-            <w:proofErr w:type="spellStart"/>
-            <w:r>
-              <w:t>diferenciada</w:t>
-            </w:r>
-            <w:proofErr w:type="spellEnd"/>
-            <w:r>
-              <w:t xml:space="preserve"> </w:t>
-            </w:r>
-            <w:proofErr w:type="spellStart"/>
-            <w:r>
-              <w:t>según</w:t>
-            </w:r>
-            <w:proofErr w:type="spellEnd"/>
-            <w:r>
-              <w:t xml:space="preserve"> </w:t>
-            </w:r>
-            <w:proofErr w:type="spellStart"/>
-            <w:r>
-              <w:t>el</w:t>
-            </w:r>
-            <w:proofErr w:type="spellEnd"/>
-            <w:r>
-              <w:t xml:space="preserve"> </w:t>
-            </w:r>
-            <w:proofErr w:type="spellStart"/>
-            <w:r>
-              <w:t>género</w:t>
-            </w:r>
-            <w:proofErr w:type="spellEnd"/>
-            <w:r>
-              <w:t xml:space="preserve">. Las </w:t>
-            </w:r>
-            <w:proofErr w:type="spellStart"/>
-            <w:r>
-              <w:t>adolescentes</w:t>
-            </w:r>
-            <w:proofErr w:type="spellEnd"/>
-            <w:r>
-              <w:t xml:space="preserve"> </w:t>
-            </w:r>
-            <w:proofErr w:type="spellStart"/>
-            <w:r>
-              <w:t>mujeres</w:t>
-            </w:r>
-            <w:proofErr w:type="spellEnd"/>
-            <w:r>
-              <w:t xml:space="preserve"> </w:t>
-            </w:r>
-            <w:proofErr w:type="spellStart"/>
-            <w:r>
-              <w:t>presentan</w:t>
-            </w:r>
-            <w:proofErr w:type="spellEnd"/>
-            <w:r>
-              <w:t xml:space="preserve"> mayor </w:t>
-            </w:r>
-            <w:proofErr w:type="spellStart"/>
-            <w:r>
-              <w:t>riesgo</w:t>
-            </w:r>
-            <w:proofErr w:type="spellEnd"/>
-            <w:r>
-              <w:t xml:space="preserve"> de </w:t>
-            </w:r>
-            <w:proofErr w:type="spellStart"/>
-            <w:r>
-              <w:t>abandono</w:t>
-            </w:r>
-            <w:proofErr w:type="spellEnd"/>
-            <w:r>
-              <w:t xml:space="preserve"> </w:t>
-            </w:r>
-            <w:proofErr w:type="spellStart"/>
-            <w:r>
-              <w:t>asociado</w:t>
-            </w:r>
-            <w:proofErr w:type="spellEnd"/>
-            <w:r>
-              <w:t xml:space="preserve"> al </w:t>
-            </w:r>
-            <w:proofErr w:type="spellStart"/>
-            <w:r>
-              <w:t>embarazo</w:t>
-            </w:r>
-            <w:proofErr w:type="spellEnd"/>
-            <w:r>
-              <w:t xml:space="preserve"> </w:t>
-            </w:r>
-            <w:proofErr w:type="spellStart"/>
-            <w:r>
-              <w:t>temprano</w:t>
-            </w:r>
-            <w:proofErr w:type="spellEnd"/>
-            <w:r>
-              <w:t xml:space="preserve"> y a </w:t>
-            </w:r>
-            <w:proofErr w:type="spellStart"/>
-            <w:r>
-              <w:t>labores</w:t>
-            </w:r>
-            <w:proofErr w:type="spellEnd"/>
-            <w:r>
-              <w:t xml:space="preserve"> de </w:t>
-            </w:r>
-            <w:proofErr w:type="spellStart"/>
-            <w:r>
-              <w:t>cuidado</w:t>
-            </w:r>
-            <w:proofErr w:type="spellEnd"/>
-            <w:r>
-              <w:t xml:space="preserve"> </w:t>
-            </w:r>
-            <w:proofErr w:type="spellStart"/>
-            <w:r>
-              <w:t>doméstico</w:t>
-            </w:r>
-            <w:proofErr w:type="spellEnd"/>
-            <w:r>
-              <w:t xml:space="preserve">, </w:t>
-            </w:r>
-            <w:proofErr w:type="spellStart"/>
-            <w:r>
-              <w:t>mientras</w:t>
-            </w:r>
-            <w:proofErr w:type="spellEnd"/>
-            <w:r>
-              <w:t xml:space="preserve"> que </w:t>
-            </w:r>
-            <w:proofErr w:type="spellStart"/>
-            <w:r>
-              <w:t>los</w:t>
-            </w:r>
-            <w:proofErr w:type="spellEnd"/>
-            <w:r>
-              <w:t xml:space="preserve"> </w:t>
-            </w:r>
-            <w:proofErr w:type="spellStart"/>
-            <w:r>
-              <w:t>varones</w:t>
-            </w:r>
-            <w:proofErr w:type="spellEnd"/>
-            <w:r>
-              <w:t xml:space="preserve"> lo </w:t>
-            </w:r>
-            <w:proofErr w:type="spellStart"/>
-            <w:r>
-              <w:t>hacen</w:t>
-            </w:r>
-            <w:proofErr w:type="spellEnd"/>
-            <w:r>
-              <w:t xml:space="preserve"> con mayor </w:t>
-            </w:r>
-            <w:proofErr w:type="spellStart"/>
-            <w:r>
-              <w:t>frecuencia</w:t>
-            </w:r>
-            <w:proofErr w:type="spellEnd"/>
-            <w:r>
-              <w:t xml:space="preserve"> </w:t>
-            </w:r>
-            <w:proofErr w:type="spellStart"/>
-            <w:r>
-              <w:t>por</w:t>
-            </w:r>
-            <w:proofErr w:type="spellEnd"/>
-            <w:r>
-              <w:t xml:space="preserve"> </w:t>
-            </w:r>
-            <w:proofErr w:type="spellStart"/>
-            <w:r>
-              <w:t>incorporación</w:t>
-            </w:r>
-            <w:proofErr w:type="spellEnd"/>
-            <w:r>
-              <w:t xml:space="preserve"> al </w:t>
-            </w:r>
-            <w:proofErr w:type="spellStart"/>
-            <w:r>
-              <w:t>trabajo</w:t>
-            </w:r>
-            <w:proofErr w:type="spellEnd"/>
-            <w:r>
-              <w:t xml:space="preserve">. También </w:t>
-            </w:r>
-            <w:proofErr w:type="spellStart"/>
-            <w:r>
-              <w:t>existen</w:t>
-            </w:r>
-            <w:proofErr w:type="spellEnd"/>
-            <w:r>
-              <w:t xml:space="preserve"> </w:t>
-            </w:r>
-            <w:proofErr w:type="spellStart"/>
-            <w:r>
-              <w:t>diferencias</w:t>
-            </w:r>
-            <w:proofErr w:type="spellEnd"/>
-            <w:r>
-              <w:t xml:space="preserve"> </w:t>
-            </w:r>
-            <w:proofErr w:type="spellStart"/>
-            <w:r>
-              <w:t>según</w:t>
-            </w:r>
-            <w:proofErr w:type="spellEnd"/>
-            <w:r>
-              <w:t xml:space="preserve"> la </w:t>
-            </w:r>
-            <w:proofErr w:type="spellStart"/>
-            <w:r>
-              <w:t>condición</w:t>
-            </w:r>
-            <w:proofErr w:type="spellEnd"/>
-            <w:r>
-              <w:t xml:space="preserve"> </w:t>
-            </w:r>
-            <w:proofErr w:type="spellStart"/>
-            <w:r>
-              <w:t>socioeconómica</w:t>
-            </w:r>
-            <w:proofErr w:type="spellEnd"/>
-            <w:r>
-              <w:t xml:space="preserve"> de </w:t>
-            </w:r>
-            <w:proofErr w:type="spellStart"/>
-            <w:r>
-              <w:t>los</w:t>
-            </w:r>
-            <w:proofErr w:type="spellEnd"/>
-            <w:r>
-              <w:t xml:space="preserve"> </w:t>
-            </w:r>
-            <w:proofErr w:type="spellStart"/>
-            <w:r>
-              <w:t>hogares</w:t>
-            </w:r>
-            <w:proofErr w:type="spellEnd"/>
-            <w:r>
-              <w:t xml:space="preserve"> y la </w:t>
-            </w:r>
-            <w:proofErr w:type="spellStart"/>
-            <w:r>
-              <w:t>ubicación</w:t>
-            </w:r>
-            <w:proofErr w:type="spellEnd"/>
-            <w:r>
-              <w:t xml:space="preserve"> </w:t>
-            </w:r>
-            <w:proofErr w:type="spellStart"/>
-            <w:r>
-              <w:t>geográfica</w:t>
-            </w:r>
-            <w:proofErr w:type="spellEnd"/>
-            <w:r>
-              <w:t xml:space="preserve">, </w:t>
-            </w:r>
-            <w:proofErr w:type="spellStart"/>
-            <w:r>
-              <w:t>siendo</w:t>
-            </w:r>
-            <w:proofErr w:type="spellEnd"/>
-            <w:r>
-              <w:t xml:space="preserve"> las zonas rurales y </w:t>
-            </w:r>
-            <w:proofErr w:type="spellStart"/>
-            <w:r>
-              <w:t>los</w:t>
-            </w:r>
-            <w:proofErr w:type="spellEnd"/>
-            <w:r>
-              <w:t xml:space="preserve"> </w:t>
-            </w:r>
-            <w:proofErr w:type="spellStart"/>
-            <w:r>
-              <w:t>sectores</w:t>
-            </w:r>
-            <w:proofErr w:type="spellEnd"/>
-            <w:r>
-              <w:t xml:space="preserve"> </w:t>
-            </w:r>
-            <w:proofErr w:type="spellStart"/>
-            <w:r>
-              <w:t>urbano-marginales</w:t>
-            </w:r>
-            <w:proofErr w:type="spellEnd"/>
-            <w:r>
-              <w:t xml:space="preserve"> </w:t>
-            </w:r>
-            <w:proofErr w:type="spellStart"/>
-            <w:r>
-              <w:t>los</w:t>
-            </w:r>
-            <w:proofErr w:type="spellEnd"/>
-            <w:r>
-              <w:t xml:space="preserve"> </w:t>
-            </w:r>
-            <w:proofErr w:type="spellStart"/>
-            <w:r>
-              <w:t>más</w:t>
-            </w:r>
-            <w:proofErr w:type="spellEnd"/>
-            <w:r>
-              <w:t xml:space="preserve"> </w:t>
-            </w:r>
-            <w:proofErr w:type="spellStart"/>
-            <w:r>
-              <w:t>afectados</w:t>
-            </w:r>
-            <w:proofErr w:type="spellEnd"/>
-            <w:r>
-              <w:t xml:space="preserve"> (Loaiza Maldonado et al., 2023). Conforme a la </w:t>
-            </w:r>
-            <w:proofErr w:type="spellStart"/>
-            <w:r>
-              <w:t>legislación</w:t>
-            </w:r>
-            <w:proofErr w:type="spellEnd"/>
-            <w:r>
-              <w:t xml:space="preserve"> </w:t>
-            </w:r>
-            <w:proofErr w:type="spellStart"/>
-            <w:r>
-              <w:t>ecuatoriana</w:t>
-            </w:r>
-            <w:proofErr w:type="spellEnd"/>
-            <w:r>
-              <w:t xml:space="preserve">, </w:t>
-            </w:r>
-            <w:proofErr w:type="spellStart"/>
-            <w:r>
-              <w:t>esta</w:t>
-            </w:r>
-            <w:proofErr w:type="spellEnd"/>
-            <w:r>
-              <w:t xml:space="preserve"> población </w:t>
-            </w:r>
-            <w:proofErr w:type="spellStart"/>
-            <w:r>
-              <w:t>corresponde</w:t>
-            </w:r>
-            <w:proofErr w:type="spellEnd"/>
-            <w:r>
-              <w:t xml:space="preserve"> a un </w:t>
-            </w:r>
-            <w:proofErr w:type="spellStart"/>
-            <w:r>
-              <w:t>grupo</w:t>
-            </w:r>
-            <w:proofErr w:type="spellEnd"/>
-            <w:r>
-              <w:t xml:space="preserve"> de </w:t>
-            </w:r>
-            <w:proofErr w:type="spellStart"/>
-            <w:r>
-              <w:t>atención</w:t>
-            </w:r>
-            <w:proofErr w:type="spellEnd"/>
-            <w:r>
-              <w:t xml:space="preserve"> </w:t>
-            </w:r>
-            <w:proofErr w:type="spellStart"/>
-            <w:r>
-              <w:t>prioritaria</w:t>
-            </w:r>
-            <w:proofErr w:type="spellEnd"/>
-            <w:r>
-              <w:t xml:space="preserve">, dado que </w:t>
-            </w:r>
-            <w:proofErr w:type="spellStart"/>
-            <w:r>
-              <w:t>niños</w:t>
-            </w:r>
-            <w:proofErr w:type="spellEnd"/>
-            <w:r>
-              <w:t xml:space="preserve">, </w:t>
-            </w:r>
-            <w:proofErr w:type="spellStart"/>
-            <w:r>
-              <w:t>niñas</w:t>
-            </w:r>
-            <w:proofErr w:type="spellEnd"/>
-            <w:r>
-              <w:t xml:space="preserve"> y </w:t>
-            </w:r>
-            <w:proofErr w:type="spellStart"/>
-            <w:r>
-              <w:t>adolescentes</w:t>
-            </w:r>
-            <w:proofErr w:type="spellEnd"/>
-            <w:r>
-              <w:t xml:space="preserve"> </w:t>
-            </w:r>
-            <w:proofErr w:type="spellStart"/>
-            <w:r>
-              <w:t>gozan</w:t>
-            </w:r>
-            <w:proofErr w:type="spellEnd"/>
-            <w:r>
-              <w:t xml:space="preserve"> de </w:t>
-            </w:r>
-            <w:proofErr w:type="spellStart"/>
-            <w:r>
-              <w:t>protección</w:t>
-            </w:r>
-            <w:proofErr w:type="spellEnd"/>
-            <w:r>
-              <w:t xml:space="preserve"> especial y del derecho </w:t>
-            </w:r>
-            <w:proofErr w:type="spellStart"/>
-            <w:r>
-              <w:t>irrenunciable</w:t>
-            </w:r>
-            <w:proofErr w:type="spellEnd"/>
-            <w:r>
-              <w:t xml:space="preserve"> a la </w:t>
-            </w:r>
-            <w:proofErr w:type="spellStart"/>
-            <w:r>
-              <w:t>educación</w:t>
-            </w:r>
-            <w:proofErr w:type="spellEnd"/>
-            <w:r>
-              <w:t>.</w:t>
+              <w:t xml:space="preserve">La deserción escolar afecta principalmente a niños, niñas y adolescentes en edad escolar, aproximadamente entre 5 y 17 años, con una incidencia diferenciada según el género. Las adolescentes mujeres presentan mayor riesgo de abandono asociado al embarazo temprano y a labores de cuidado doméstico, mientras que los varones lo hacen con mayor frecuencia por incorporación al trabajo. También existen diferencias según la condición socioeconómica de los hogares y la ubicación geográfica, siendo las zonas rurales y los sectores urbano-marginales los más afectados (Loaiza Maldonado et al., 2023). Conforme a la legislación ecuatoriana, esta población corresponde a un grupo de atención prioritaria, dado que niños, niñas y adolescentes gozan de protección especial y del derecho irrenunciable a la educación (Asamblea Nacional del Ecuador, 2008, arts. 26 y 35).</w:t>
             </w:r>
           </w:p>
           <w:p>
@@ -9381,6 +8525,40 @@
             <w:gridSpan w:val="2"/>
             <w:vAlign w:val="center"/>
           </w:tcPr>
+          <w:p>
+            <w:pPr>
+              <w:spacing w:before="120" w:after="120"/>
+              <w:ind w:left="720" w:hanging="720"/>
+              <w:jc w:val="both"/>
+              <w:rPr>
+                <w:sz w:val="22"/>
+                <w:lang w:val="es-EC"/>
+              </w:rPr>
+            </w:pPr>
+            <w:r>
+              <w:rPr>
+                <w:sz w:val="22"/>
+                <w:lang w:val="es-EC"/>
+              </w:rPr>
+              <w:t xml:space="preserve">Asamblea Nacional del Ecuador. (2008). </w:t>
+            </w:r>
+            <w:r>
+              <w:rPr>
+                <w:i/>
+                <w:iCs/>
+                <w:sz w:val="22"/>
+                <w:lang w:val="es-EC"/>
+              </w:rPr>
+              <w:t xml:space="preserve">Constitución de la República del Ecuador</w:t>
+            </w:r>
+            <w:r>
+              <w:rPr>
+                <w:sz w:val="22"/>
+                <w:lang w:val="es-EC"/>
+              </w:rPr>
+              <w:t xml:space="preserve">. https://www.asambleanacional.gob.ec/es/noticia/constitucion_2008_una_esperanza_de_cambio_y_reivindicacion_de_derechos</w:t>
+            </w:r>
+          </w:p>
           <w:p>
             <w:pPr>
               <w:spacing w:before="120" w:after="120"/>

</xml_diff>